<commit_message>
Keep the Proof v1.0.1: layout fix on release-readiness doc (keep Customer deliverables section together)
Documentation-only layout correction to the Release Readiness PDF and DOCX: the
Customer deliverables heading now stays with its opening paragraph and the
three-file bulleted list (the section moves cleanly to page 2 rather than
leaving an orphaned heading). PDF uses KeepTogether; DOCX uses keepNext/keepLines
on the heading, intro, and file bullets. Files remain a vertical one-per-bullet
list. All wording, technical results, dates, hashes, and release status are
unchanged. No product PDF, bundle, Start Here, handbook, ledger, or source file
was modified. Both pages re-rendered and visually inspected.

Co-Authored-By: Claude Opus 4.8 <noreply@anthropic.com>
Claude-Session: https://claude.ai/code/session_01ToTykVvAYrMhrswtJBy37S
</commit_message>
<xml_diff>
--- a/keeptheproof/KEEP_THE_PROOF_v1.0.1_RC5_RELEASE_READINESS.docx
+++ b/keeptheproof/KEEP_THE_PROOF_v1.0.1_RC5_RELEASE_READINESS.docx
@@ -85,6 +85,8 @@
     <w:p>
       <w:pPr>
         <w:pStyle w:val="Heading1"/>
+        <w:keepNext/>
+        <w:keepLines/>
         <w:spacing w:after="90" w:before="260"/>
       </w:pPr>
       <w:r>
@@ -484,6 +486,8 @@
     <w:p>
       <w:pPr>
         <w:pStyle w:val="Heading1"/>
+        <w:keepNext/>
+        <w:keepLines/>
         <w:spacing w:after="90" w:before="260"/>
       </w:pPr>
       <w:r>
@@ -606,6 +610,8 @@
     <w:p>
       <w:pPr>
         <w:pStyle w:val="Heading1"/>
+        <w:keepNext/>
+        <w:keepLines/>
         <w:spacing w:after="90" w:before="260"/>
       </w:pPr>
       <w:r>
@@ -1222,6 +1228,8 @@
     <w:p>
       <w:pPr>
         <w:pStyle w:val="Heading1"/>
+        <w:keepNext/>
+        <w:keepLines/>
         <w:spacing w:after="90" w:before="260"/>
       </w:pPr>
       <w:r>
@@ -1238,6 +1246,7 @@
     </w:p>
     <w:p>
       <w:pPr>
+        <w:keepNext/>
         <w:spacing w:after="120" w:line="276"/>
       </w:pPr>
       <w:r>
@@ -1264,6 +1273,7 @@
     <w:p>
       <w:pPr>
         <w:pStyle w:val="ListParagraph"/>
+        <w:keepNext/>
         <w:numPr>
           <w:ilvl w:val="0"/>
           <w:numId w:val="1"/>
@@ -1283,6 +1293,7 @@
     <w:p>
       <w:pPr>
         <w:pStyle w:val="ListParagraph"/>
+        <w:keepNext/>
         <w:numPr>
           <w:ilvl w:val="0"/>
           <w:numId w:val="1"/>
@@ -1302,6 +1313,7 @@
     <w:p>
       <w:pPr>
         <w:pStyle w:val="ListParagraph"/>
+        <w:keepNext/>
         <w:numPr>
           <w:ilvl w:val="0"/>
           <w:numId w:val="1"/>
@@ -1355,6 +1367,8 @@
     <w:p>
       <w:pPr>
         <w:pStyle w:val="Heading1"/>
+        <w:keepNext/>
+        <w:keepLines/>
         <w:spacing w:after="90" w:before="260"/>
       </w:pPr>
       <w:r>
@@ -1690,6 +1704,8 @@
     <w:p>
       <w:pPr>
         <w:pStyle w:val="Heading1"/>
+        <w:keepNext/>
+        <w:keepLines/>
         <w:spacing w:after="90" w:before="260"/>
       </w:pPr>
       <w:r>
@@ -1732,6 +1748,8 @@
     <w:p>
       <w:pPr>
         <w:pStyle w:val="Heading1"/>
+        <w:keepNext/>
+        <w:keepLines/>
         <w:spacing w:after="90" w:before="260"/>
       </w:pPr>
       <w:r>

</xml_diff>